<commit_message>
v1.4.0: drug names and patient row in English, open site groups, README and paper data
- en.json: Chinese drug names (pembrolizumab, pemetrexed, carboplatin,
  KRAS G12C inhibitor …), 'positive', age/sex and CNS-status rows; category
  chips translate as one string
- structured form opens the brain and other-site groups by default
- README section for v1.4.0; version 1.4.0
- paper: rule catalogue 24 finding identifiers (METASTASIS_TNM_INCONSISTENT),
  test count 786 in Fig. 1; other figures unchanged (metadata-only diffs
  dropped); QC unchanged

Co-Authored-By: Claude Opus 5.5 <noreply@anthropic.com>
Claude-Session: https://claude.ai/code/session_01EY4rzzbvvBz8Qb4bwtQwqw
</commit_message>
<xml_diff>
--- a/paper/tables/ExtendedDataTable3.docx
+++ b/paper/tables/ExtendedDataTable3.docx
@@ -1675,6 +1675,92 @@
                 <w:b w:val="0"/>
                 <w:sz w:val="14"/>
               </w:rPr>
+              <w:t>METASTASIS_TNM_INCONSISTENT</w:t>
+            </w:r>
+          </w:p>
+        </w:tc>
+        <w:tc>
+          <w:tcPr>
+            <w:tcW w:type="dxa" w:w="850"/>
+            <w:tcBorders>
+              <w:top w:val="nil"/>
+              <w:left w:val="nil"/>
+              <w:bottom w:val="nil"/>
+              <w:right w:val="nil"/>
+            </w:tcBorders>
+          </w:tcPr>
+          <w:p>
+            <w:r/>
+            <w:r>
+              <w:rPr>
+                <w:b w:val="0"/>
+                <w:sz w:val="14"/>
+              </w:rPr>
+              <w:t>warn</w:t>
+            </w:r>
+          </w:p>
+        </w:tc>
+        <w:tc>
+          <w:tcPr>
+            <w:tcW w:type="dxa" w:w="4649"/>
+            <w:tcBorders>
+              <w:top w:val="nil"/>
+              <w:left w:val="nil"/>
+              <w:bottom w:val="nil"/>
+              <w:right w:val="nil"/>
+            </w:tcBorders>
+          </w:tcPr>
+          <w:p>
+            <w:r/>
+            <w:r>
+              <w:rPr>
+                <w:b w:val="0"/>
+                <w:sz w:val="14"/>
+              </w:rPr>
+              <w:t>(same rule)</w:t>
+            </w:r>
+          </w:p>
+        </w:tc>
+        <w:tc>
+          <w:tcPr>
+            <w:tcW w:type="dxa" w:w="1020"/>
+            <w:tcBorders>
+              <w:top w:val="nil"/>
+              <w:left w:val="nil"/>
+              <w:bottom w:val="nil"/>
+              <w:right w:val="nil"/>
+            </w:tcBorders>
+          </w:tcPr>
+          <w:p>
+            <w:r/>
+            <w:r>
+              <w:rPr>
+                <w:b w:val="0"/>
+                <w:sz w:val="14"/>
+              </w:rPr>
+              <w:t>0</w:t>
+            </w:r>
+          </w:p>
+        </w:tc>
+      </w:tr>
+      <w:tr>
+        <w:tc>
+          <w:tcPr>
+            <w:tcW w:type="dxa" w:w="2608"/>
+            <w:tcBorders>
+              <w:top w:val="nil"/>
+              <w:left w:val="nil"/>
+              <w:bottom w:val="nil"/>
+              <w:right w:val="nil"/>
+            </w:tcBorders>
+          </w:tcPr>
+          <w:p>
+            <w:r/>
+            <w:r>
+              <w:rPr>
+                <w:b w:val="0"/>
+                <w:sz w:val="14"/>
+              </w:rPr>
               <w:t>ORGAN_FUNCTION_GATE</w:t>
             </w:r>
           </w:p>
@@ -2093,7 +2179,7 @@
         <w:rPr>
           <w:sz w:val="13"/>
         </w:rPr>
-        <w:t>The 20 rules raise 23 finding identifiers; '(same rule)' marks a further identifier raised by the rule in the row above.</w:t>
+        <w:t>The 20 rules raise 24 finding identifiers; '(same rule)' marks a further identifier raised by the rule in the row above.</w:t>
       </w:r>
     </w:p>
     <w:p>

</xml_diff>